<commit_message>
discussion , theme and mac compilation changes
</commit_message>
<xml_diff>
--- a/Documentation/Healoo_Design_Document_v2.docx
+++ b/Documentation/Healoo_Design_Document_v2.docx
@@ -109,7 +109,7 @@
       <w:r>
         <w:fldChar w:fldCharType="separate"/>
       </w:r>
-      <w:hyperlink w:anchor="_Toc241434373" w:history="1">
+      <w:hyperlink w:anchor="_Toc241437585" w:history="1">
         <w:r>
           <w:rPr>
             <w:rStyle w:val="Hyperlink"/>
@@ -136,7 +136,7 @@
             <w:noProof/>
             <w:webHidden/>
           </w:rPr>
-          <w:instrText xml:space="preserve"> PAGEREF _Toc241434373 \h </w:instrText>
+          <w:instrText xml:space="preserve"> PAGEREF _Toc241437585 \h </w:instrText>
         </w:r>
         <w:r>
           <w:rPr>
@@ -180,7 +180,7 @@
           <w:szCs w:val="22"/>
         </w:rPr>
       </w:pPr>
-      <w:hyperlink w:anchor="_Toc241434374" w:history="1">
+      <w:hyperlink w:anchor="_Toc241437586" w:history="1">
         <w:r>
           <w:rPr>
             <w:rStyle w:val="Hyperlink"/>
@@ -207,7 +207,7 @@
             <w:noProof/>
             <w:webHidden/>
           </w:rPr>
-          <w:instrText xml:space="preserve"> PAGEREF _Toc241434374 \h </w:instrText>
+          <w:instrText xml:space="preserve"> PAGEREF _Toc241437586 \h </w:instrText>
         </w:r>
         <w:r>
           <w:rPr>
@@ -251,7 +251,7 @@
           <w:szCs w:val="22"/>
         </w:rPr>
       </w:pPr>
-      <w:hyperlink w:anchor="_Toc241434375" w:history="1">
+      <w:hyperlink w:anchor="_Toc241437587" w:history="1">
         <w:r>
           <w:rPr>
             <w:rStyle w:val="Hyperlink"/>
@@ -278,7 +278,7 @@
             <w:noProof/>
             <w:webHidden/>
           </w:rPr>
-          <w:instrText xml:space="preserve"> PAGEREF _Toc241434375 \h </w:instrText>
+          <w:instrText xml:space="preserve"> PAGEREF _Toc241437587 \h </w:instrText>
         </w:r>
         <w:r>
           <w:rPr>
@@ -322,7 +322,7 @@
           <w:szCs w:val="22"/>
         </w:rPr>
       </w:pPr>
-      <w:hyperlink w:anchor="_Toc241434376" w:history="1">
+      <w:hyperlink w:anchor="_Toc241437588" w:history="1">
         <w:r>
           <w:rPr>
             <w:rStyle w:val="Hyperlink"/>
@@ -349,7 +349,7 @@
             <w:noProof/>
             <w:webHidden/>
           </w:rPr>
-          <w:instrText xml:space="preserve"> PAGEREF _Toc241434376 \h </w:instrText>
+          <w:instrText xml:space="preserve"> PAGEREF _Toc241437588 \h </w:instrText>
         </w:r>
         <w:r>
           <w:rPr>
@@ -393,7 +393,7 @@
           <w:szCs w:val="22"/>
         </w:rPr>
       </w:pPr>
-      <w:hyperlink w:anchor="_Toc241434377" w:history="1">
+      <w:hyperlink w:anchor="_Toc241437589" w:history="1">
         <w:r>
           <w:rPr>
             <w:rStyle w:val="Hyperlink"/>
@@ -420,7 +420,7 @@
             <w:noProof/>
             <w:webHidden/>
           </w:rPr>
-          <w:instrText xml:space="preserve"> PAGEREF _Toc241434377 \h </w:instrText>
+          <w:instrText xml:space="preserve"> PAGEREF _Toc241437589 \h </w:instrText>
         </w:r>
         <w:r>
           <w:rPr>
@@ -464,7 +464,7 @@
           <w:szCs w:val="22"/>
         </w:rPr>
       </w:pPr>
-      <w:hyperlink w:anchor="_Toc241434378" w:history="1">
+      <w:hyperlink w:anchor="_Toc241437590" w:history="1">
         <w:r>
           <w:rPr>
             <w:rStyle w:val="Hyperlink"/>
@@ -491,7 +491,7 @@
             <w:noProof/>
             <w:webHidden/>
           </w:rPr>
-          <w:instrText xml:space="preserve"> PAGEREF _Toc241434378 \h </w:instrText>
+          <w:instrText xml:space="preserve"> PAGEREF _Toc241437590 \h </w:instrText>
         </w:r>
         <w:r>
           <w:rPr>
@@ -535,7 +535,7 @@
           <w:szCs w:val="22"/>
         </w:rPr>
       </w:pPr>
-      <w:hyperlink w:anchor="_Toc241434379" w:history="1">
+      <w:hyperlink w:anchor="_Toc241437591" w:history="1">
         <w:r>
           <w:rPr>
             <w:rStyle w:val="Hyperlink"/>
@@ -562,7 +562,7 @@
             <w:noProof/>
             <w:webHidden/>
           </w:rPr>
-          <w:instrText xml:space="preserve"> PAGEREF _Toc241434379 \h </w:instrText>
+          <w:instrText xml:space="preserve"> PAGEREF _Toc241437591 \h </w:instrText>
         </w:r>
         <w:r>
           <w:rPr>
@@ -606,7 +606,7 @@
           <w:szCs w:val="22"/>
         </w:rPr>
       </w:pPr>
-      <w:hyperlink w:anchor="_Toc241434380" w:history="1">
+      <w:hyperlink w:anchor="_Toc241437592" w:history="1">
         <w:r>
           <w:rPr>
             <w:rStyle w:val="Hyperlink"/>
@@ -633,7 +633,7 @@
             <w:noProof/>
             <w:webHidden/>
           </w:rPr>
-          <w:instrText xml:space="preserve"> PAGEREF _Toc241434380 \h </w:instrText>
+          <w:instrText xml:space="preserve"> PAGEREF _Toc241437592 \h </w:instrText>
         </w:r>
         <w:r>
           <w:rPr>
@@ -677,7 +677,7 @@
           <w:szCs w:val="22"/>
         </w:rPr>
       </w:pPr>
-      <w:hyperlink w:anchor="_Toc241434381" w:history="1">
+      <w:hyperlink w:anchor="_Toc241437593" w:history="1">
         <w:r>
           <w:rPr>
             <w:rStyle w:val="Hyperlink"/>
@@ -704,7 +704,7 @@
             <w:noProof/>
             <w:webHidden/>
           </w:rPr>
-          <w:instrText xml:space="preserve"> PAGEREF _Toc241434381 \h </w:instrText>
+          <w:instrText xml:space="preserve"> PAGEREF _Toc241437593 \h </w:instrText>
         </w:r>
         <w:r>
           <w:rPr>
@@ -748,7 +748,7 @@
           <w:szCs w:val="22"/>
         </w:rPr>
       </w:pPr>
-      <w:hyperlink w:anchor="_Toc241434382" w:history="1">
+      <w:hyperlink w:anchor="_Toc241437594" w:history="1">
         <w:r>
           <w:rPr>
             <w:rStyle w:val="Hyperlink"/>
@@ -775,7 +775,7 @@
             <w:noProof/>
             <w:webHidden/>
           </w:rPr>
-          <w:instrText xml:space="preserve"> PAGEREF _Toc241434382 \h </w:instrText>
+          <w:instrText xml:space="preserve"> PAGEREF _Toc241437594 \h </w:instrText>
         </w:r>
         <w:r>
           <w:rPr>
@@ -819,7 +819,7 @@
           <w:szCs w:val="22"/>
         </w:rPr>
       </w:pPr>
-      <w:hyperlink w:anchor="_Toc241434383" w:history="1">
+      <w:hyperlink w:anchor="_Toc241437595" w:history="1">
         <w:r>
           <w:rPr>
             <w:rStyle w:val="Hyperlink"/>
@@ -846,7 +846,7 @@
             <w:noProof/>
             <w:webHidden/>
           </w:rPr>
-          <w:instrText xml:space="preserve"> PAGEREF _Toc241434383 \h </w:instrText>
+          <w:instrText xml:space="preserve"> PAGEREF _Toc241437595 \h </w:instrText>
         </w:r>
         <w:r>
           <w:rPr>
@@ -890,7 +890,7 @@
           <w:szCs w:val="22"/>
         </w:rPr>
       </w:pPr>
-      <w:hyperlink w:anchor="_Toc241434384" w:history="1">
+      <w:hyperlink w:anchor="_Toc241437596" w:history="1">
         <w:r>
           <w:rPr>
             <w:rStyle w:val="Hyperlink"/>
@@ -917,7 +917,7 @@
             <w:noProof/>
             <w:webHidden/>
           </w:rPr>
-          <w:instrText xml:space="preserve"> PAGEREF _Toc241434384 \h </w:instrText>
+          <w:instrText xml:space="preserve"> PAGEREF _Toc241437596 \h </w:instrText>
         </w:r>
         <w:r>
           <w:rPr>
@@ -961,7 +961,7 @@
           <w:szCs w:val="22"/>
         </w:rPr>
       </w:pPr>
-      <w:hyperlink w:anchor="_Toc241434385" w:history="1">
+      <w:hyperlink w:anchor="_Toc241437597" w:history="1">
         <w:r>
           <w:rPr>
             <w:rStyle w:val="Hyperlink"/>
@@ -988,7 +988,7 @@
             <w:noProof/>
             <w:webHidden/>
           </w:rPr>
-          <w:instrText xml:space="preserve"> PAGEREF _Toc241434385 \h </w:instrText>
+          <w:instrText xml:space="preserve"> PAGEREF _Toc241437597 \h </w:instrText>
         </w:r>
         <w:r>
           <w:rPr>
@@ -1032,7 +1032,7 @@
           <w:szCs w:val="22"/>
         </w:rPr>
       </w:pPr>
-      <w:hyperlink w:anchor="_Toc241434386" w:history="1">
+      <w:hyperlink w:anchor="_Toc241437598" w:history="1">
         <w:r>
           <w:rPr>
             <w:rStyle w:val="Hyperlink"/>
@@ -1059,7 +1059,7 @@
             <w:noProof/>
             <w:webHidden/>
           </w:rPr>
-          <w:instrText xml:space="preserve"> PAGEREF _Toc241434386 \h </w:instrText>
+          <w:instrText xml:space="preserve"> PAGEREF _Toc241437598 \h </w:instrText>
         </w:r>
         <w:r>
           <w:rPr>
@@ -1103,7 +1103,7 @@
           <w:szCs w:val="22"/>
         </w:rPr>
       </w:pPr>
-      <w:hyperlink w:anchor="_Toc241434387" w:history="1">
+      <w:hyperlink w:anchor="_Toc241437599" w:history="1">
         <w:r>
           <w:rPr>
             <w:rStyle w:val="Hyperlink"/>
@@ -1130,7 +1130,7 @@
             <w:noProof/>
             <w:webHidden/>
           </w:rPr>
-          <w:instrText xml:space="preserve"> PAGEREF _Toc241434387 \h </w:instrText>
+          <w:instrText xml:space="preserve"> PAGEREF _Toc241437599 \h </w:instrText>
         </w:r>
         <w:r>
           <w:rPr>
@@ -1174,7 +1174,7 @@
           <w:szCs w:val="22"/>
         </w:rPr>
       </w:pPr>
-      <w:hyperlink w:anchor="_Toc241434388" w:history="1">
+      <w:hyperlink w:anchor="_Toc241437600" w:history="1">
         <w:r>
           <w:rPr>
             <w:rStyle w:val="Hyperlink"/>
@@ -1201,7 +1201,7 @@
             <w:noProof/>
             <w:webHidden/>
           </w:rPr>
-          <w:instrText xml:space="preserve"> PAGEREF _Toc241434388 \h </w:instrText>
+          <w:instrText xml:space="preserve"> PAGEREF _Toc241437600 \h </w:instrText>
         </w:r>
         <w:r>
           <w:rPr>
@@ -1245,7 +1245,7 @@
           <w:szCs w:val="22"/>
         </w:rPr>
       </w:pPr>
-      <w:hyperlink w:anchor="_Toc241434389" w:history="1">
+      <w:hyperlink w:anchor="_Toc241437601" w:history="1">
         <w:r>
           <w:rPr>
             <w:rStyle w:val="Hyperlink"/>
@@ -1272,7 +1272,7 @@
             <w:noProof/>
             <w:webHidden/>
           </w:rPr>
-          <w:instrText xml:space="preserve"> PAGEREF _Toc241434389 \h </w:instrText>
+          <w:instrText xml:space="preserve"> PAGEREF _Toc241437601 \h </w:instrText>
         </w:r>
         <w:r>
           <w:rPr>
@@ -1316,7 +1316,7 @@
           <w:szCs w:val="22"/>
         </w:rPr>
       </w:pPr>
-      <w:hyperlink w:anchor="_Toc241434390" w:history="1">
+      <w:hyperlink w:anchor="_Toc241437602" w:history="1">
         <w:r>
           <w:rPr>
             <w:rStyle w:val="Hyperlink"/>
@@ -1343,7 +1343,7 @@
             <w:noProof/>
             <w:webHidden/>
           </w:rPr>
-          <w:instrText xml:space="preserve"> PAGEREF _Toc241434390 \h </w:instrText>
+          <w:instrText xml:space="preserve"> PAGEREF _Toc241437602 \h </w:instrText>
         </w:r>
         <w:r>
           <w:rPr>
@@ -1387,7 +1387,7 @@
           <w:szCs w:val="22"/>
         </w:rPr>
       </w:pPr>
-      <w:hyperlink w:anchor="_Toc241434391" w:history="1">
+      <w:hyperlink w:anchor="_Toc241437603" w:history="1">
         <w:r>
           <w:rPr>
             <w:rStyle w:val="Hyperlink"/>
@@ -1414,7 +1414,7 @@
             <w:noProof/>
             <w:webHidden/>
           </w:rPr>
-          <w:instrText xml:space="preserve"> PAGEREF _Toc241434391 \h </w:instrText>
+          <w:instrText xml:space="preserve"> PAGEREF _Toc241437603 \h </w:instrText>
         </w:r>
         <w:r>
           <w:rPr>
@@ -1434,7 +1434,7 @@
             <w:noProof/>
             <w:webHidden/>
           </w:rPr>
-          <w:t>9</w:t>
+          <w:t>8</w:t>
         </w:r>
         <w:r>
           <w:rPr>
@@ -1458,7 +1458,7 @@
           <w:szCs w:val="22"/>
         </w:rPr>
       </w:pPr>
-      <w:hyperlink w:anchor="_Toc241434392" w:history="1">
+      <w:hyperlink w:anchor="_Toc241437604" w:history="1">
         <w:r>
           <w:rPr>
             <w:rStyle w:val="Hyperlink"/>
@@ -1485,7 +1485,7 @@
             <w:noProof/>
             <w:webHidden/>
           </w:rPr>
-          <w:instrText xml:space="preserve"> PAGEREF _Toc241434392 \h </w:instrText>
+          <w:instrText xml:space="preserve"> PAGEREF _Toc241437604 \h </w:instrText>
         </w:r>
         <w:r>
           <w:rPr>
@@ -1529,7 +1529,7 @@
           <w:szCs w:val="22"/>
         </w:rPr>
       </w:pPr>
-      <w:hyperlink w:anchor="_Toc241434393" w:history="1">
+      <w:hyperlink w:anchor="_Toc241437605" w:history="1">
         <w:r>
           <w:rPr>
             <w:rStyle w:val="Hyperlink"/>
@@ -1556,7 +1556,7 @@
             <w:noProof/>
             <w:webHidden/>
           </w:rPr>
-          <w:instrText xml:space="preserve"> PAGEREF _Toc241434393 \h </w:instrText>
+          <w:instrText xml:space="preserve"> PAGEREF _Toc241437605 \h </w:instrText>
         </w:r>
         <w:r>
           <w:rPr>
@@ -1600,7 +1600,7 @@
           <w:szCs w:val="22"/>
         </w:rPr>
       </w:pPr>
-      <w:hyperlink w:anchor="_Toc241434394" w:history="1">
+      <w:hyperlink w:anchor="_Toc241437606" w:history="1">
         <w:r>
           <w:rPr>
             <w:rStyle w:val="Hyperlink"/>
@@ -1627,7 +1627,7 @@
             <w:noProof/>
             <w:webHidden/>
           </w:rPr>
-          <w:instrText xml:space="preserve"> PAGEREF _Toc241434394 \h </w:instrText>
+          <w:instrText xml:space="preserve"> PAGEREF _Toc241437606 \h </w:instrText>
         </w:r>
         <w:r>
           <w:rPr>
@@ -1671,7 +1671,7 @@
           <w:szCs w:val="22"/>
         </w:rPr>
       </w:pPr>
-      <w:hyperlink w:anchor="_Toc241434395" w:history="1">
+      <w:hyperlink w:anchor="_Toc241437607" w:history="1">
         <w:r>
           <w:rPr>
             <w:rStyle w:val="Hyperlink"/>
@@ -1698,7 +1698,7 @@
             <w:noProof/>
             <w:webHidden/>
           </w:rPr>
-          <w:instrText xml:space="preserve"> PAGEREF _Toc241434395 \h </w:instrText>
+          <w:instrText xml:space="preserve"> PAGEREF _Toc241437607 \h </w:instrText>
         </w:r>
         <w:r>
           <w:rPr>
@@ -1742,7 +1742,7 @@
           <w:szCs w:val="22"/>
         </w:rPr>
       </w:pPr>
-      <w:hyperlink w:anchor="_Toc241434396" w:history="1">
+      <w:hyperlink w:anchor="_Toc241437608" w:history="1">
         <w:r>
           <w:rPr>
             <w:rStyle w:val="Hyperlink"/>
@@ -1769,7 +1769,7 @@
             <w:noProof/>
             <w:webHidden/>
           </w:rPr>
-          <w:instrText xml:space="preserve"> PAGEREF _Toc241434396 \h </w:instrText>
+          <w:instrText xml:space="preserve"> PAGEREF _Toc241437608 \h </w:instrText>
         </w:r>
         <w:r>
           <w:rPr>
@@ -1813,7 +1813,7 @@
           <w:szCs w:val="22"/>
         </w:rPr>
       </w:pPr>
-      <w:hyperlink w:anchor="_Toc241434397" w:history="1">
+      <w:hyperlink w:anchor="_Toc241437609" w:history="1">
         <w:r>
           <w:rPr>
             <w:rStyle w:val="Hyperlink"/>
@@ -1840,7 +1840,7 @@
             <w:noProof/>
             <w:webHidden/>
           </w:rPr>
-          <w:instrText xml:space="preserve"> PAGEREF _Toc241434397 \h </w:instrText>
+          <w:instrText xml:space="preserve"> PAGEREF _Toc241437609 \h </w:instrText>
         </w:r>
         <w:r>
           <w:rPr>
@@ -1884,7 +1884,7 @@
           <w:szCs w:val="22"/>
         </w:rPr>
       </w:pPr>
-      <w:hyperlink w:anchor="_Toc241434398" w:history="1">
+      <w:hyperlink w:anchor="_Toc241437610" w:history="1">
         <w:r>
           <w:rPr>
             <w:rStyle w:val="Hyperlink"/>
@@ -1911,7 +1911,7 @@
             <w:noProof/>
             <w:webHidden/>
           </w:rPr>
-          <w:instrText xml:space="preserve"> PAGEREF _Toc241434398 \h </w:instrText>
+          <w:instrText xml:space="preserve"> PAGEREF _Toc241437610 \h </w:instrText>
         </w:r>
         <w:r>
           <w:rPr>
@@ -1955,7 +1955,7 @@
           <w:szCs w:val="22"/>
         </w:rPr>
       </w:pPr>
-      <w:hyperlink w:anchor="_Toc241434399" w:history="1">
+      <w:hyperlink w:anchor="_Toc241437611" w:history="1">
         <w:r>
           <w:rPr>
             <w:rStyle w:val="Hyperlink"/>
@@ -1982,7 +1982,7 @@
             <w:noProof/>
             <w:webHidden/>
           </w:rPr>
-          <w:instrText xml:space="preserve"> PAGEREF _Toc241434399 \h </w:instrText>
+          <w:instrText xml:space="preserve"> PAGEREF _Toc241437611 \h </w:instrText>
         </w:r>
         <w:r>
           <w:rPr>
@@ -2026,7 +2026,7 @@
           <w:szCs w:val="22"/>
         </w:rPr>
       </w:pPr>
-      <w:hyperlink w:anchor="_Toc241434400" w:history="1">
+      <w:hyperlink w:anchor="_Toc241437612" w:history="1">
         <w:r>
           <w:rPr>
             <w:rStyle w:val="Hyperlink"/>
@@ -2053,7 +2053,7 @@
             <w:noProof/>
             <w:webHidden/>
           </w:rPr>
-          <w:instrText xml:space="preserve"> PAGEREF _Toc241434400 \h </w:instrText>
+          <w:instrText xml:space="preserve"> PAGEREF _Toc241437612 \h </w:instrText>
         </w:r>
         <w:r>
           <w:rPr>
@@ -2097,7 +2097,7 @@
           <w:szCs w:val="22"/>
         </w:rPr>
       </w:pPr>
-      <w:hyperlink w:anchor="_Toc241434401" w:history="1">
+      <w:hyperlink w:anchor="_Toc241437613" w:history="1">
         <w:r>
           <w:rPr>
             <w:rStyle w:val="Hyperlink"/>
@@ -2124,7 +2124,7 @@
             <w:noProof/>
             <w:webHidden/>
           </w:rPr>
-          <w:instrText xml:space="preserve"> PAGEREF _Toc241434401 \h </w:instrText>
+          <w:instrText xml:space="preserve"> PAGEREF _Toc241437613 \h </w:instrText>
         </w:r>
         <w:r>
           <w:rPr>
@@ -2168,7 +2168,7 @@
           <w:szCs w:val="22"/>
         </w:rPr>
       </w:pPr>
-      <w:hyperlink w:anchor="_Toc241434402" w:history="1">
+      <w:hyperlink w:anchor="_Toc241437614" w:history="1">
         <w:r>
           <w:rPr>
             <w:rStyle w:val="Hyperlink"/>
@@ -2195,7 +2195,7 @@
             <w:noProof/>
             <w:webHidden/>
           </w:rPr>
-          <w:instrText xml:space="preserve"> PAGEREF _Toc241434402 \h </w:instrText>
+          <w:instrText xml:space="preserve"> PAGEREF _Toc241437614 \h </w:instrText>
         </w:r>
         <w:r>
           <w:rPr>
@@ -2239,7 +2239,7 @@
           <w:szCs w:val="22"/>
         </w:rPr>
       </w:pPr>
-      <w:hyperlink w:anchor="_Toc241434403" w:history="1">
+      <w:hyperlink w:anchor="_Toc241437615" w:history="1">
         <w:r>
           <w:rPr>
             <w:rStyle w:val="Hyperlink"/>
@@ -2266,7 +2266,7 @@
             <w:noProof/>
             <w:webHidden/>
           </w:rPr>
-          <w:instrText xml:space="preserve"> PAGEREF _Toc241434403 \h </w:instrText>
+          <w:instrText xml:space="preserve"> PAGEREF _Toc241437615 \h </w:instrText>
         </w:r>
         <w:r>
           <w:rPr>
@@ -2310,7 +2310,7 @@
           <w:szCs w:val="22"/>
         </w:rPr>
       </w:pPr>
-      <w:hyperlink w:anchor="_Toc241434404" w:history="1">
+      <w:hyperlink w:anchor="_Toc241437616" w:history="1">
         <w:r>
           <w:rPr>
             <w:rStyle w:val="Hyperlink"/>
@@ -2337,7 +2337,7 @@
             <w:noProof/>
             <w:webHidden/>
           </w:rPr>
-          <w:instrText xml:space="preserve"> PAGEREF _Toc241434404 \h </w:instrText>
+          <w:instrText xml:space="preserve"> PAGEREF _Toc241437616 \h </w:instrText>
         </w:r>
         <w:r>
           <w:rPr>
@@ -2381,7 +2381,7 @@
           <w:szCs w:val="22"/>
         </w:rPr>
       </w:pPr>
-      <w:hyperlink w:anchor="_Toc241434405" w:history="1">
+      <w:hyperlink w:anchor="_Toc241437617" w:history="1">
         <w:r>
           <w:rPr>
             <w:rStyle w:val="Hyperlink"/>
@@ -2408,7 +2408,7 @@
             <w:noProof/>
             <w:webHidden/>
           </w:rPr>
-          <w:instrText xml:space="preserve"> PAGEREF _Toc241434405 \h </w:instrText>
+          <w:instrText xml:space="preserve"> PAGEREF _Toc241437617 \h </w:instrText>
         </w:r>
         <w:r>
           <w:rPr>
@@ -2452,7 +2452,7 @@
           <w:szCs w:val="22"/>
         </w:rPr>
       </w:pPr>
-      <w:hyperlink w:anchor="_Toc241434406" w:history="1">
+      <w:hyperlink w:anchor="_Toc241437618" w:history="1">
         <w:r>
           <w:rPr>
             <w:rStyle w:val="Hyperlink"/>
@@ -2479,7 +2479,7 @@
             <w:noProof/>
             <w:webHidden/>
           </w:rPr>
-          <w:instrText xml:space="preserve"> PAGEREF _Toc241434406 \h </w:instrText>
+          <w:instrText xml:space="preserve"> PAGEREF _Toc241437618 \h </w:instrText>
         </w:r>
         <w:r>
           <w:rPr>
@@ -2523,7 +2523,7 @@
           <w:szCs w:val="22"/>
         </w:rPr>
       </w:pPr>
-      <w:hyperlink w:anchor="_Toc241434407" w:history="1">
+      <w:hyperlink w:anchor="_Toc241437619" w:history="1">
         <w:r>
           <w:rPr>
             <w:rStyle w:val="Hyperlink"/>
@@ -2550,7 +2550,7 @@
             <w:noProof/>
             <w:webHidden/>
           </w:rPr>
-          <w:instrText xml:space="preserve"> PAGEREF _Toc241434407 \h </w:instrText>
+          <w:instrText xml:space="preserve"> PAGEREF _Toc241437619 \h </w:instrText>
         </w:r>
         <w:r>
           <w:rPr>
@@ -2594,7 +2594,7 @@
           <w:szCs w:val="22"/>
         </w:rPr>
       </w:pPr>
-      <w:hyperlink w:anchor="_Toc241434408" w:history="1">
+      <w:hyperlink w:anchor="_Toc241437620" w:history="1">
         <w:r>
           <w:rPr>
             <w:rStyle w:val="Hyperlink"/>
@@ -2621,7 +2621,7 @@
             <w:noProof/>
             <w:webHidden/>
           </w:rPr>
-          <w:instrText xml:space="preserve"> PAGEREF _Toc241434408 \h </w:instrText>
+          <w:instrText xml:space="preserve"> PAGEREF _Toc241437620 \h </w:instrText>
         </w:r>
         <w:r>
           <w:rPr>
@@ -2665,7 +2665,7 @@
           <w:szCs w:val="22"/>
         </w:rPr>
       </w:pPr>
-      <w:hyperlink w:anchor="_Toc241434409" w:history="1">
+      <w:hyperlink w:anchor="_Toc241437621" w:history="1">
         <w:r>
           <w:rPr>
             <w:rStyle w:val="Hyperlink"/>
@@ -2692,7 +2692,7 @@
             <w:noProof/>
             <w:webHidden/>
           </w:rPr>
-          <w:instrText xml:space="preserve"> PAGEREF _Toc241434409 \h </w:instrText>
+          <w:instrText xml:space="preserve"> PAGEREF _Toc241437621 \h </w:instrText>
         </w:r>
         <w:r>
           <w:rPr>
@@ -2736,7 +2736,7 @@
           <w:szCs w:val="22"/>
         </w:rPr>
       </w:pPr>
-      <w:hyperlink w:anchor="_Toc241434410" w:history="1">
+      <w:hyperlink w:anchor="_Toc241437622" w:history="1">
         <w:r>
           <w:rPr>
             <w:rStyle w:val="Hyperlink"/>
@@ -2763,7 +2763,7 @@
             <w:noProof/>
             <w:webHidden/>
           </w:rPr>
-          <w:instrText xml:space="preserve"> PAGEREF _Toc241434410 \h </w:instrText>
+          <w:instrText xml:space="preserve"> PAGEREF _Toc241437622 \h </w:instrText>
         </w:r>
         <w:r>
           <w:rPr>
@@ -2807,7 +2807,7 @@
           <w:szCs w:val="22"/>
         </w:rPr>
       </w:pPr>
-      <w:hyperlink w:anchor="_Toc241434411" w:history="1">
+      <w:hyperlink w:anchor="_Toc241437623" w:history="1">
         <w:r>
           <w:rPr>
             <w:rStyle w:val="Hyperlink"/>
@@ -2834,7 +2834,7 @@
             <w:noProof/>
             <w:webHidden/>
           </w:rPr>
-          <w:instrText xml:space="preserve"> PAGEREF _Toc241434411 \h </w:instrText>
+          <w:instrText xml:space="preserve"> PAGEREF _Toc241437623 \h </w:instrText>
         </w:r>
         <w:r>
           <w:rPr>
@@ -2878,7 +2878,7 @@
           <w:szCs w:val="22"/>
         </w:rPr>
       </w:pPr>
-      <w:hyperlink w:anchor="_Toc241434412" w:history="1">
+      <w:hyperlink w:anchor="_Toc241437624" w:history="1">
         <w:r>
           <w:rPr>
             <w:rStyle w:val="Hyperlink"/>
@@ -2905,7 +2905,7 @@
             <w:noProof/>
             <w:webHidden/>
           </w:rPr>
-          <w:instrText xml:space="preserve"> PAGEREF _Toc241434412 \h </w:instrText>
+          <w:instrText xml:space="preserve"> PAGEREF _Toc241437624 \h </w:instrText>
         </w:r>
         <w:r>
           <w:rPr>
@@ -2949,7 +2949,7 @@
           <w:szCs w:val="22"/>
         </w:rPr>
       </w:pPr>
-      <w:hyperlink w:anchor="_Toc241434413" w:history="1">
+      <w:hyperlink w:anchor="_Toc241437625" w:history="1">
         <w:r>
           <w:rPr>
             <w:rStyle w:val="Hyperlink"/>
@@ -2976,7 +2976,7 @@
             <w:noProof/>
             <w:webHidden/>
           </w:rPr>
-          <w:instrText xml:space="preserve"> PAGEREF _Toc241434413 \h </w:instrText>
+          <w:instrText xml:space="preserve"> PAGEREF _Toc241437625 \h </w:instrText>
         </w:r>
         <w:r>
           <w:rPr>
@@ -3020,7 +3020,7 @@
           <w:szCs w:val="22"/>
         </w:rPr>
       </w:pPr>
-      <w:hyperlink w:anchor="_Toc241434414" w:history="1">
+      <w:hyperlink w:anchor="_Toc241437626" w:history="1">
         <w:r>
           <w:rPr>
             <w:rStyle w:val="Hyperlink"/>
@@ -3047,7 +3047,7 @@
             <w:noProof/>
             <w:webHidden/>
           </w:rPr>
-          <w:instrText xml:space="preserve"> PAGEREF _Toc241434414 \h </w:instrText>
+          <w:instrText xml:space="preserve"> PAGEREF _Toc241437626 \h </w:instrText>
         </w:r>
         <w:r>
           <w:rPr>
@@ -3091,7 +3091,7 @@
           <w:szCs w:val="22"/>
         </w:rPr>
       </w:pPr>
-      <w:hyperlink w:anchor="_Toc241434415" w:history="1">
+      <w:hyperlink w:anchor="_Toc241437627" w:history="1">
         <w:r>
           <w:rPr>
             <w:rStyle w:val="Hyperlink"/>
@@ -3118,7 +3118,7 @@
             <w:noProof/>
             <w:webHidden/>
           </w:rPr>
-          <w:instrText xml:space="preserve"> PAGEREF _Toc241434415 \h </w:instrText>
+          <w:instrText xml:space="preserve"> PAGEREF _Toc241437627 \h </w:instrText>
         </w:r>
         <w:r>
           <w:rPr>
@@ -3162,7 +3162,7 @@
           <w:szCs w:val="22"/>
         </w:rPr>
       </w:pPr>
-      <w:hyperlink w:anchor="_Toc241434416" w:history="1">
+      <w:hyperlink w:anchor="_Toc241437628" w:history="1">
         <w:r>
           <w:rPr>
             <w:rStyle w:val="Hyperlink"/>
@@ -3189,7 +3189,7 @@
             <w:noProof/>
             <w:webHidden/>
           </w:rPr>
-          <w:instrText xml:space="preserve"> PAGEREF _Toc241434416 \h </w:instrText>
+          <w:instrText xml:space="preserve"> PAGEREF _Toc241437628 \h </w:instrText>
         </w:r>
         <w:r>
           <w:rPr>
@@ -3233,7 +3233,7 @@
           <w:szCs w:val="22"/>
         </w:rPr>
       </w:pPr>
-      <w:hyperlink w:anchor="_Toc241434417" w:history="1">
+      <w:hyperlink w:anchor="_Toc241437629" w:history="1">
         <w:r>
           <w:rPr>
             <w:rStyle w:val="Hyperlink"/>
@@ -3260,7 +3260,7 @@
             <w:noProof/>
             <w:webHidden/>
           </w:rPr>
-          <w:instrText xml:space="preserve"> PAGEREF _Toc241434417 \h </w:instrText>
+          <w:instrText xml:space="preserve"> PAGEREF _Toc241437629 \h </w:instrText>
         </w:r>
         <w:r>
           <w:rPr>
@@ -3304,7 +3304,7 @@
           <w:szCs w:val="22"/>
         </w:rPr>
       </w:pPr>
-      <w:hyperlink w:anchor="_Toc241434418" w:history="1">
+      <w:hyperlink w:anchor="_Toc241437630" w:history="1">
         <w:r>
           <w:rPr>
             <w:rStyle w:val="Hyperlink"/>
@@ -3331,7 +3331,7 @@
             <w:noProof/>
             <w:webHidden/>
           </w:rPr>
-          <w:instrText xml:space="preserve"> PAGEREF _Toc241434418 \h </w:instrText>
+          <w:instrText xml:space="preserve"> PAGEREF _Toc241437630 \h </w:instrText>
         </w:r>
         <w:r>
           <w:rPr>
@@ -3375,7 +3375,7 @@
           <w:szCs w:val="22"/>
         </w:rPr>
       </w:pPr>
-      <w:hyperlink w:anchor="_Toc241434419" w:history="1">
+      <w:hyperlink w:anchor="_Toc241437631" w:history="1">
         <w:r>
           <w:rPr>
             <w:rStyle w:val="Hyperlink"/>
@@ -3402,7 +3402,7 @@
             <w:noProof/>
             <w:webHidden/>
           </w:rPr>
-          <w:instrText xml:space="preserve"> PAGEREF _Toc241434419 \h </w:instrText>
+          <w:instrText xml:space="preserve"> PAGEREF _Toc241437631 \h </w:instrText>
         </w:r>
         <w:r>
           <w:rPr>
@@ -3443,7 +3443,7 @@
         <w:pStyle w:val="Heading1"/>
         <w:pageBreakBefore/>
       </w:pPr>
-      <w:bookmarkStart w:id="0" w:name="_Toc241434373"/>
+      <w:bookmarkStart w:id="0" w:name="_Toc241437585"/>
       <w:r>
         <w:lastRenderedPageBreak/>
         <w:t>Part 1 — User requirements</w:t>
@@ -3454,7 +3454,7 @@
       <w:pPr>
         <w:pStyle w:val="Heading1"/>
       </w:pPr>
-      <w:bookmarkStart w:id="1" w:name="_Toc241434374"/>
+      <w:bookmarkStart w:id="1" w:name="_Toc241437586"/>
       <w:r>
         <w:t>1. Purpose and people</w:t>
       </w:r>
@@ -3878,7 +3878,7 @@
       <w:pPr>
         <w:pStyle w:val="Heading1"/>
       </w:pPr>
-      <w:bookmarkStart w:id="2" w:name="_Toc241434375"/>
+      <w:bookmarkStart w:id="2" w:name="_Toc241437587"/>
       <w:r>
         <w:t>2. Signing in and accounts</w:t>
       </w:r>
@@ -3958,7 +3958,7 @@
       <w:pPr>
         <w:pStyle w:val="Heading1"/>
       </w:pPr>
-      <w:bookmarkStart w:id="3" w:name="_Toc241434376"/>
+      <w:bookmarkStart w:id="3" w:name="_Toc241437588"/>
       <w:r>
         <w:t>3. Layout and navigation</w:t>
       </w:r>
@@ -4108,17 +4108,17 @@
         </w:numPr>
       </w:pPr>
       <w:r>
-        <w:t>Theme colour #AAB5AD (grey-green) for headers, buttons, selected chips and til</w:t>
-      </w:r>
-      <w:r>
-        <w:t>es, with dark text on it; links and icons on light backgrounds use a darker shade of it (#4B5A51) so they stay readable.</w:t>
+        <w:t>Theme colour: sage green #2F6B5E for headers, buttons, selected chips and tile</w:t>
+      </w:r>
+      <w:r>
+        <w:t>s, with white text on it; links and icons use the same green.</w:t>
       </w:r>
     </w:p>
     <w:p>
       <w:pPr>
         <w:pStyle w:val="Heading1"/>
       </w:pPr>
-      <w:bookmarkStart w:id="4" w:name="_Toc241434377"/>
+      <w:bookmarkStart w:id="4" w:name="_Toc241437589"/>
       <w:r>
         <w:t>4. Landing page (Home)</w:t>
       </w:r>
@@ -4128,7 +4128,7 @@
       <w:pPr>
         <w:pStyle w:val="Heading2"/>
       </w:pPr>
-      <w:bookmarkStart w:id="5" w:name="_Toc241434378"/>
+      <w:bookmarkStart w:id="5" w:name="_Toc241437590"/>
       <w:r>
         <w:t>4.1 What it shows</w:t>
       </w:r>
@@ -4155,10 +4155,7 @@
         </w:numPr>
       </w:pPr>
       <w:r>
-        <w:t xml:space="preserve">Three </w:t>
-      </w:r>
-      <w:r>
-        <w:t xml:space="preserve">dashboard tiles: </w:t>
+        <w:t xml:space="preserve">Three dashboard tiles: </w:t>
       </w:r>
       <w:r>
         <w:rPr>
@@ -4167,7 +4164,10 @@
         <w:t>Open reports</w:t>
       </w:r>
       <w:r>
-        <w:t xml:space="preserve"> (open items containing a report), </w:t>
+        <w:t xml:space="preserve"> (open items containing a repo</w:t>
+      </w:r>
+      <w:r>
+        <w:t xml:space="preserve">rt), </w:t>
       </w:r>
       <w:r>
         <w:rPr>
@@ -4197,10 +4197,10 @@
         </w:numPr>
       </w:pPr>
       <w:r>
-        <w:t>A compact search box and small role chips (All, Doctors, Users, Hospital</w:t>
-      </w:r>
-      <w:r>
-        <w:t>s, Labs). Searching or tapping a chip opens Search with that filter. A fine line separates this Find section from Open items, without adding space.</w:t>
+        <w:t>A compact search box and small role chips (All, Doctors, Users, Hospitals, Labs). Searching or tapping a chip opens Search with tha</w:t>
+      </w:r>
+      <w:r>
+        <w:t>t filter. A fine line separates this Find section from Open items, without adding space.</w:t>
       </w:r>
     </w:p>
     <w:p>
@@ -4221,19 +4221,19 @@
         <w:t>Open items</w:t>
       </w:r>
       <w:r>
-        <w:t xml:space="preserve"> list: the 20 most recently changed open items, newest first. Any addition to an item (message</w:t>
-      </w:r>
-      <w:r>
-        <w:t>, file, appointment, alert) moves it to the top.</w:t>
+        <w:t xml:space="preserve"> list: the 20 most recently changed open items, newest first. Any addition to an item (message, file, appointment, alert) moves it to the top.</w:t>
       </w:r>
     </w:p>
     <w:p>
       <w:pPr>
         <w:pStyle w:val="Heading2"/>
       </w:pPr>
-      <w:bookmarkStart w:id="6" w:name="_Toc241434379"/>
-      <w:r>
-        <w:t>4.2 Dashboard tiles filter the list</w:t>
+      <w:bookmarkStart w:id="6" w:name="_Toc241437591"/>
+      <w:r>
+        <w:t>4.2 Dashbo</w:t>
+      </w:r>
+      <w:r>
+        <w:t>ard tiles filter the list</w:t>
       </w:r>
       <w:bookmarkEnd w:id="6"/>
     </w:p>
@@ -4246,10 +4246,7 @@
         </w:numPr>
       </w:pPr>
       <w:r>
-        <w:t>Tapping a tile highlights it (the tile turns white) and filters Open items to items containing that kind of content: reports, messages or appointments. The heading changes</w:t>
-      </w:r>
-      <w:r>
-        <w:t xml:space="preserve"> to, for example, “Open items · Reports”.</w:t>
+        <w:t>Tapping a tile highlights it (the tile turns white) and filters Open items to items containing that kind of content: reports, messages or appointments. The heading changes to, for example, “Open items · Reports”.</w:t>
       </w:r>
     </w:p>
     <w:p>
@@ -4261,8 +4258,10 @@
         </w:numPr>
       </w:pPr>
       <w:r>
-        <w:lastRenderedPageBreak/>
-        <w:t xml:space="preserve">Tapping the highlighted tile again, or </w:t>
+        <w:t>Tapping the highl</w:t>
+      </w:r>
+      <w:r>
+        <w:t xml:space="preserve">ighted tile again, or </w:t>
       </w:r>
       <w:r>
         <w:rPr>
@@ -4283,6 +4282,7 @@
         </w:numPr>
       </w:pPr>
       <w:r>
+        <w:lastRenderedPageBreak/>
         <w:t>If nothing matches, the list says so (for example “No open items with reports.”).</w:t>
       </w:r>
     </w:p>
@@ -4290,12 +4290,9 @@
       <w:pPr>
         <w:pStyle w:val="Heading2"/>
       </w:pPr>
-      <w:bookmarkStart w:id="7" w:name="_Toc241434380"/>
-      <w:r>
-        <w:t>4.3 Listin</w:t>
-      </w:r>
-      <w:r>
-        <w:t>g items</w:t>
+      <w:bookmarkStart w:id="7" w:name="_Toc241437592"/>
+      <w:r>
+        <w:t>4.3 Listing items</w:t>
       </w:r>
       <w:bookmarkEnd w:id="7"/>
     </w:p>
@@ -4308,10 +4305,10 @@
         </w:numPr>
       </w:pPr>
       <w:r>
-        <w:t>Each row shows an icon for the item’s kind, its title, a short description, when it last changed, in the phone’s time zone (“6.37pm, Fri 4/16” this year, “6.37pm 4/16/2025” for earlier years) and a coloured label (Report, Message, Appointment, Aler</w:t>
-      </w:r>
-      <w:r>
-        <w:t>t).</w:t>
+        <w:t>Each row shows an icon for the item’s kind, its tit</w:t>
+      </w:r>
+      <w:r>
+        <w:t>le, a short description, when it last changed, in the phone’s time zone (“6.37pm, Fri 4/16” this year, “6.37pm 4/16/2025” for earlier years) and a coloured label (Report, Message, Appointment, Alert).</w:t>
       </w:r>
     </w:p>
     <w:p>
@@ -4332,7 +4329,10 @@
         <w:t>See all</w:t>
       </w:r>
       <w:r>
-        <w:t xml:space="preserve"> expands the list in place to up to 100 items; </w:t>
+        <w:t xml:space="preserve"> expands t</w:t>
+      </w:r>
+      <w:r>
+        <w:t xml:space="preserve">he list in place to up to 100 items; </w:t>
       </w:r>
       <w:r>
         <w:rPr>
@@ -4365,17 +4365,14 @@
         </w:numPr>
       </w:pPr>
       <w:r>
-        <w:t>The list and the counters update by themselves when something cha</w:t>
-      </w:r>
-      <w:r>
-        <w:t>nges while the app is open (section 11).</w:t>
+        <w:t>The list and the counters update by themselves when something changes while the app is open (section 11).</w:t>
       </w:r>
     </w:p>
     <w:p>
       <w:pPr>
         <w:pStyle w:val="Heading1"/>
       </w:pPr>
-      <w:bookmarkStart w:id="8" w:name="_Toc241434381"/>
+      <w:bookmarkStart w:id="8" w:name="_Toc241437593"/>
       <w:r>
         <w:t>5. Items</w:t>
       </w:r>
@@ -4386,7 +4383,10 @@
         <w:pStyle w:val="BodyText"/>
       </w:pPr>
       <w:r>
-        <w:t>An item is one case: for example “CBC – Complete blood count” or “Appointment with Dr. Anitha Rao”. It is created from one primary part, then grows as people add to it.</w:t>
+        <w:t>An item i</w:t>
+      </w:r>
+      <w:r>
+        <w:t>s one case: for example “CBC – Complete blood count” or “Appointment with Dr. Anitha Rao”. It is created from one primary part, then grows as people add to it.</w:t>
       </w:r>
     </w:p>
     <w:tbl>
@@ -4682,16 +4682,16 @@
         <w:pStyle w:val="BodyText"/>
       </w:pPr>
       <w:r>
+        <w:t>The item page shows the header (title, kind, status, keywords, who it is shared with), then sections for attachments, discussion, appointments and alerts, each with an Add action for people with full access.</w:t>
+      </w:r>
+    </w:p>
+    <w:p>
+      <w:pPr>
+        <w:pStyle w:val="Heading1"/>
+      </w:pPr>
+      <w:bookmarkStart w:id="9" w:name="_Toc241437594"/>
+      <w:r>
         <w:lastRenderedPageBreak/>
-        <w:t>The item page shows the header (title, kind, status, keywords, who it is shared with), then sections for attachments, discussion, appointments and alerts, each with an Add action for people with full access.</w:t>
-      </w:r>
-    </w:p>
-    <w:p>
-      <w:pPr>
-        <w:pStyle w:val="Heading1"/>
-      </w:pPr>
-      <w:bookmarkStart w:id="9" w:name="_Toc241434382"/>
-      <w:r>
         <w:t>6. Messages</w:t>
       </w:r>
       <w:bookmarkEnd w:id="9"/>
@@ -4700,7 +4700,7 @@
       <w:pPr>
         <w:pStyle w:val="Heading2"/>
       </w:pPr>
-      <w:bookmarkStart w:id="10" w:name="_Toc241434383"/>
+      <w:bookmarkStart w:id="10" w:name="_Toc241437595"/>
       <w:r>
         <w:t>6.1 Where messages live</w:t>
       </w:r>
@@ -4767,7 +4767,7 @@
       <w:pPr>
         <w:pStyle w:val="Heading2"/>
       </w:pPr>
-      <w:bookmarkStart w:id="11" w:name="_Toc241434384"/>
+      <w:bookmarkStart w:id="11" w:name="_Toc241437596"/>
       <w:r>
         <w:t>6.2 Sending a message</w:t>
       </w:r>
@@ -4858,7 +4858,7 @@
       <w:pPr>
         <w:pStyle w:val="Heading2"/>
       </w:pPr>
-      <w:bookmarkStart w:id="12" w:name="_Toc241434385"/>
+      <w:bookmarkStart w:id="12" w:name="_Toc241437597"/>
       <w:r>
         <w:t>6.3 Receiving and listing messages</w:t>
       </w:r>
@@ -4972,7 +4972,6 @@
         </w:numPr>
       </w:pPr>
       <w:r>
-        <w:lastRenderedPageBreak/>
         <w:t xml:space="preserve">A person’s page has a </w:t>
       </w:r>
       <w:r>
@@ -4992,8 +4991,9 @@
       <w:pPr>
         <w:pStyle w:val="Heading1"/>
       </w:pPr>
-      <w:bookmarkStart w:id="13" w:name="_Toc241434386"/>
-      <w:r>
+      <w:bookmarkStart w:id="13" w:name="_Toc241437598"/>
+      <w:r>
+        <w:lastRenderedPageBreak/>
         <w:t>7. Person pages and their operations</w:t>
       </w:r>
       <w:bookmarkEnd w:id="13"/>
@@ -5560,7 +5560,6 @@
               <w:pStyle w:val="Compact"/>
             </w:pPr>
             <w:r>
-              <w:lastRenderedPageBreak/>
               <w:t>Doctors (hospital page)</w:t>
             </w:r>
           </w:p>
@@ -5592,8 +5591,9 @@
       <w:pPr>
         <w:pStyle w:val="Heading1"/>
       </w:pPr>
-      <w:bookmarkStart w:id="14" w:name="_Toc241434387"/>
-      <w:r>
+      <w:bookmarkStart w:id="14" w:name="_Toc241437599"/>
+      <w:r>
+        <w:lastRenderedPageBreak/>
         <w:t>8. Upload and sharing</w:t>
       </w:r>
       <w:bookmarkEnd w:id="14"/>
@@ -5692,7 +5692,7 @@
       <w:pPr>
         <w:pStyle w:val="Heading1"/>
       </w:pPr>
-      <w:bookmarkStart w:id="15" w:name="_Toc241434388"/>
+      <w:bookmarkStart w:id="15" w:name="_Toc241437600"/>
       <w:r>
         <w:t>9. Appointments, alerts and calendar</w:t>
       </w:r>
@@ -5783,7 +5783,7 @@
       <w:pPr>
         <w:pStyle w:val="Heading1"/>
       </w:pPr>
-      <w:bookmarkStart w:id="16" w:name="_Toc241434389"/>
+      <w:bookmarkStart w:id="16" w:name="_Toc241437601"/>
       <w:r>
         <w:t>10. Search, contacts, settings and adm</w:t>
       </w:r>
@@ -5796,7 +5796,7 @@
       <w:pPr>
         <w:pStyle w:val="Heading2"/>
       </w:pPr>
-      <w:bookmarkStart w:id="17" w:name="_Toc241434390"/>
+      <w:bookmarkStart w:id="17" w:name="_Toc241437602"/>
       <w:r>
         <w:t>10.1 Search and contacts</w:t>
       </w:r>
@@ -5823,7 +5823,6 @@
         </w:numPr>
       </w:pPr>
       <w:r>
-        <w:lastRenderedPageBreak/>
         <w:t>A reminder on the Search screen explains that health data opens only after connecting and after the owner</w:t>
       </w:r>
       <w:r>
@@ -5846,7 +5845,7 @@
       <w:pPr>
         <w:pStyle w:val="Heading2"/>
       </w:pPr>
-      <w:bookmarkStart w:id="18" w:name="_Toc241434391"/>
+      <w:bookmarkStart w:id="18" w:name="_Toc241437603"/>
       <w:r>
         <w:t>10.2 Settings</w:t>
       </w:r>
@@ -5876,6 +5875,7 @@
         <w:rPr>
           <w:b/>
         </w:rPr>
+        <w:lastRenderedPageBreak/>
         <w:t>Profile picture:</w:t>
       </w:r>
       <w:r>
@@ -5910,7 +5910,7 @@
       <w:pPr>
         <w:pStyle w:val="Heading2"/>
       </w:pPr>
-      <w:bookmarkStart w:id="19" w:name="_Toc241434392"/>
+      <w:bookmarkStart w:id="19" w:name="_Toc241437604"/>
       <w:r>
         <w:t>10.3 Administ</w:t>
       </w:r>
@@ -6022,7 +6022,7 @@
       <w:pPr>
         <w:pStyle w:val="Heading1"/>
       </w:pPr>
-      <w:bookmarkStart w:id="20" w:name="_Toc241434393"/>
+      <w:bookmarkStart w:id="20" w:name="_Toc241437605"/>
       <w:r>
         <w:t>11. Who can see what</w:t>
       </w:r>
@@ -6320,7 +6320,6 @@
               <w:pStyle w:val="Compact"/>
             </w:pPr>
             <w:r>
-              <w:lastRenderedPageBreak/>
               <w:t>8</w:t>
             </w:r>
           </w:p>
@@ -6411,8 +6410,9 @@
       <w:pPr>
         <w:pStyle w:val="Heading1"/>
       </w:pPr>
-      <w:bookmarkStart w:id="21" w:name="_Toc241434394"/>
-      <w:r>
+      <w:bookmarkStart w:id="21" w:name="_Toc241437606"/>
+      <w:r>
+        <w:lastRenderedPageBreak/>
         <w:t>12. Viewing files</w:t>
       </w:r>
       <w:bookmarkEnd w:id="21"/>
@@ -6505,7 +6505,7 @@
       <w:pPr>
         <w:pStyle w:val="Heading1"/>
       </w:pPr>
-      <w:bookmarkStart w:id="22" w:name="_Toc241434395"/>
+      <w:bookmarkStart w:id="22" w:name="_Toc241437607"/>
       <w:r>
         <w:t>13. Keeping the screen up to date</w:t>
       </w:r>
@@ -6594,7 +6594,7 @@
         <w:pStyle w:val="Heading1"/>
         <w:pageBreakBefore/>
       </w:pPr>
-      <w:bookmarkStart w:id="23" w:name="_Toc241434396"/>
+      <w:bookmarkStart w:id="23" w:name="_Toc241437608"/>
       <w:r>
         <w:lastRenderedPageBreak/>
         <w:t>Part 2 — Implementation</w:t>
@@ -6605,7 +6605,7 @@
       <w:pPr>
         <w:pStyle w:val="Heading1"/>
       </w:pPr>
-      <w:bookmarkStart w:id="24" w:name="_Toc241434397"/>
+      <w:bookmarkStart w:id="24" w:name="_Toc241437609"/>
       <w:r>
         <w:t>14. Architecture</w:t>
       </w:r>
@@ -7149,7 +7149,7 @@
       <w:pPr>
         <w:pStyle w:val="Heading1"/>
       </w:pPr>
-      <w:bookmarkStart w:id="25" w:name="_Toc241434398"/>
+      <w:bookmarkStart w:id="25" w:name="_Toc241437610"/>
       <w:r>
         <w:lastRenderedPageBreak/>
         <w:t>15. WUI — the Android and iOS apps</w:t>
@@ -7160,7 +7160,7 @@
       <w:pPr>
         <w:pStyle w:val="Heading2"/>
       </w:pPr>
-      <w:bookmarkStart w:id="26" w:name="_Toc241434399"/>
+      <w:bookmarkStart w:id="26" w:name="_Toc241437611"/>
       <w:r>
         <w:t>15.1 Technology and structure</w:t>
       </w:r>
@@ -7693,7 +7693,7 @@
       <w:pPr>
         <w:pStyle w:val="Heading2"/>
       </w:pPr>
-      <w:bookmarkStart w:id="27" w:name="_Toc241434400"/>
+      <w:bookmarkStart w:id="27" w:name="_Toc241437612"/>
       <w:r>
         <w:t>15.2 Minimum requirements</w:t>
       </w:r>
@@ -8009,7 +8009,7 @@
       <w:pPr>
         <w:pStyle w:val="Heading2"/>
       </w:pPr>
-      <w:bookmarkStart w:id="28" w:name="_Toc241434401"/>
+      <w:bookmarkStart w:id="28" w:name="_Toc241437613"/>
       <w:r>
         <w:t>15.3 Memory and size</w:t>
       </w:r>
@@ -8369,7 +8369,7 @@
       <w:pPr>
         <w:pStyle w:val="Heading2"/>
       </w:pPr>
-      <w:bookmarkStart w:id="29" w:name="_Toc241434402"/>
+      <w:bookmarkStart w:id="29" w:name="_Toc241437614"/>
       <w:r>
         <w:t>15.4 When data is fetched</w:t>
       </w:r>
@@ -8920,7 +8920,7 @@
       <w:pPr>
         <w:pStyle w:val="Heading2"/>
       </w:pPr>
-      <w:bookmarkStart w:id="30" w:name="_Toc241434403"/>
+      <w:bookmarkStart w:id="30" w:name="_Toc241437615"/>
       <w:r>
         <w:t>15.5 Live</w:t>
       </w:r>
@@ -8999,7 +8999,7 @@
       <w:pPr>
         <w:pStyle w:val="Heading2"/>
       </w:pPr>
-      <w:bookmarkStart w:id="31" w:name="_Toc241434404"/>
+      <w:bookmarkStart w:id="31" w:name="_Toc241437616"/>
       <w:r>
         <w:t>15.6 Local storage and caching</w:t>
       </w:r>
@@ -9470,7 +9470,7 @@
       <w:pPr>
         <w:pStyle w:val="Heading2"/>
       </w:pPr>
-      <w:bookmarkStart w:id="32" w:name="_Toc241434405"/>
+      <w:bookmarkStart w:id="32" w:name="_Toc241437617"/>
       <w:r>
         <w:t>15.7 Configuration</w:t>
       </w:r>
@@ -9672,7 +9672,7 @@
       <w:pPr>
         <w:pStyle w:val="Heading2"/>
       </w:pPr>
-      <w:bookmarkStart w:id="33" w:name="_Toc241434406"/>
+      <w:bookmarkStart w:id="33" w:name="_Toc241437618"/>
       <w:r>
         <w:t>15.8 App size and performance</w:t>
       </w:r>
@@ -10291,7 +10291,7 @@
       <w:pPr>
         <w:pStyle w:val="Heading1"/>
       </w:pPr>
-      <w:bookmarkStart w:id="34" w:name="_Toc241434407"/>
+      <w:bookmarkStart w:id="34" w:name="_Toc241437619"/>
       <w:r>
         <w:t>16. Servers</w:t>
       </w:r>
@@ -10301,7 +10301,7 @@
       <w:pPr>
         <w:pStyle w:val="Heading2"/>
       </w:pPr>
-      <w:bookmarkStart w:id="35" w:name="_Toc241434408"/>
+      <w:bookmarkStart w:id="35" w:name="_Toc241437620"/>
       <w:r>
         <w:t>16.1 Components</w:t>
       </w:r>
@@ -10749,7 +10749,7 @@
       <w:pPr>
         <w:pStyle w:val="Heading2"/>
       </w:pPr>
-      <w:bookmarkStart w:id="36" w:name="_Toc241434409"/>
+      <w:bookmarkStart w:id="36" w:name="_Toc241437621"/>
       <w:r>
         <w:t>16.2 Minimum requirements</w:t>
       </w:r>
@@ -10983,7 +10983,7 @@
       <w:pPr>
         <w:pStyle w:val="Heading2"/>
       </w:pPr>
-      <w:bookmarkStart w:id="37" w:name="_Toc241434410"/>
+      <w:bookmarkStart w:id="37" w:name="_Toc241437622"/>
       <w:r>
         <w:t>16.3 Memory use</w:t>
       </w:r>
@@ -11337,7 +11337,7 @@
       <w:pPr>
         <w:pStyle w:val="Heading2"/>
       </w:pPr>
-      <w:bookmarkStart w:id="38" w:name="_Toc241434411"/>
+      <w:bookmarkStart w:id="38" w:name="_Toc241437623"/>
       <w:r>
         <w:t>16.4 Request capacity and limits</w:t>
       </w:r>
@@ -12011,7 +12011,7 @@
       <w:pPr>
         <w:pStyle w:val="Heading2"/>
       </w:pPr>
-      <w:bookmarkStart w:id="39" w:name="_Toc241434412"/>
+      <w:bookmarkStart w:id="39" w:name="_Toc241437624"/>
       <w:r>
         <w:t>16.5 How data is stored</w:t>
       </w:r>
@@ -12649,7 +12649,7 @@
       <w:pPr>
         <w:pStyle w:val="Heading2"/>
       </w:pPr>
-      <w:bookmarkStart w:id="40" w:name="_Toc241434413"/>
+      <w:bookmarkStart w:id="40" w:name="_Toc241437625"/>
       <w:r>
         <w:t>16.6 Background jobs and timing</w:t>
       </w:r>
@@ -12948,7 +12948,7 @@
       <w:pPr>
         <w:pStyle w:val="Heading2"/>
       </w:pPr>
-      <w:bookmarkStart w:id="41" w:name="_Toc241434414"/>
+      <w:bookmarkStart w:id="41" w:name="_Toc241437626"/>
       <w:r>
         <w:t>16.7 Server caching</w:t>
       </w:r>
@@ -13305,7 +13305,7 @@
       <w:pPr>
         <w:pStyle w:val="Heading2"/>
       </w:pPr>
-      <w:bookmarkStart w:id="42" w:name="_Toc241434415"/>
+      <w:bookmarkStart w:id="42" w:name="_Toc241437627"/>
       <w:r>
         <w:t>16.8 Authentication and access control</w:t>
       </w:r>
@@ -13369,7 +13369,7 @@
       <w:pPr>
         <w:pStyle w:val="Heading2"/>
       </w:pPr>
-      <w:bookmarkStart w:id="43" w:name="_Toc241434416"/>
+      <w:bookmarkStart w:id="43" w:name="_Toc241437628"/>
       <w:r>
         <w:lastRenderedPageBreak/>
         <w:t>16.9 API</w:t>
@@ -14225,7 +14225,7 @@
       <w:pPr>
         <w:pStyle w:val="Heading2"/>
       </w:pPr>
-      <w:bookmarkStart w:id="44" w:name="_Toc241434417"/>
+      <w:bookmarkStart w:id="44" w:name="_Toc241437629"/>
       <w:r>
         <w:t>16.10 Deployment profiles</w:t>
       </w:r>
@@ -14533,7 +14533,7 @@
       <w:pPr>
         <w:pStyle w:val="Heading2"/>
       </w:pPr>
-      <w:bookmarkStart w:id="45" w:name="_Toc241434418"/>
+      <w:bookmarkStart w:id="45" w:name="_Toc241437630"/>
       <w:r>
         <w:t>16.11 Tests and trial accounts</w:t>
       </w:r>
@@ -14582,7 +14582,7 @@
       <w:pPr>
         <w:pStyle w:val="Heading2"/>
       </w:pPr>
-      <w:bookmarkStart w:id="46" w:name="_Toc241434419"/>
+      <w:bookmarkStart w:id="46" w:name="_Toc241437631"/>
       <w:r>
         <w:t>16.12 Before real patient data</w:t>
       </w:r>

</xml_diff>